<commit_message>
docs: support guide library - master catalog, generator system, Wave 1 guides
docs/support becomes the TA-team documentation system: README.md is the
master catalog (guide families A-H mapped to organization presets, Wave 1-3
build order, versioning rule), and every guide is generated from
docs/support/generators (shared branding + 9-section template in
lib/guide-lib.js) so the whole library stays visually and structurally
identical.

Wave 1 guides (code-verified content):
- Getting Started & Navigation
- Projects, Issues & Boards
- Sprints & Work Cycles (v1.1: step lists restart per subsection)
- Teams, Members & Permissions
- Budget & Expenses
</commit_message>
<xml_diff>
--- a/docs/support/ONEKOF_SUPPORT_GUIDE_SPRINTS.docx
+++ b/docs/support/ONEKOF_SUPPORT_GUIDE_SPRINTS.docx
@@ -109,7 +109,7 @@
           <w:sz w:val="21"/>
           <w:szCs w:val="21"/>
         </w:rPr>
-        <w:t xml:space="preserve">Version 1.0 · July 25, 2026</w:t>
+        <w:t xml:space="preserve">Version 1.1 · July 25, 2026</w:t>
       </w:r>
     </w:p>
     <w:p>
@@ -1021,7 +1021,7 @@
         <w:pStyle w:val="ListParagraph"/>
         <w:numPr>
           <w:ilvl w:val="0"/>
-          <w:numId w:val="3"/>
+          <w:numId w:val="4"/>
         </w:numPr>
         <w:spacing w:after="60"/>
       </w:pPr>
@@ -1038,7 +1038,7 @@
         <w:pStyle w:val="ListParagraph"/>
         <w:numPr>
           <w:ilvl w:val="0"/>
-          <w:numId w:val="3"/>
+          <w:numId w:val="4"/>
         </w:numPr>
         <w:spacing w:after="60"/>
       </w:pPr>
@@ -1055,7 +1055,7 @@
         <w:pStyle w:val="ListParagraph"/>
         <w:numPr>
           <w:ilvl w:val="0"/>
-          <w:numId w:val="3"/>
+          <w:numId w:val="4"/>
         </w:numPr>
         <w:spacing w:after="60"/>
       </w:pPr>
@@ -1088,7 +1088,7 @@
         <w:pStyle w:val="ListParagraph"/>
         <w:numPr>
           <w:ilvl w:val="0"/>
-          <w:numId w:val="3"/>
+          <w:numId w:val="5"/>
         </w:numPr>
         <w:spacing w:after="60"/>
       </w:pPr>
@@ -1105,7 +1105,7 @@
         <w:pStyle w:val="ListParagraph"/>
         <w:numPr>
           <w:ilvl w:val="0"/>
-          <w:numId w:val="3"/>
+          <w:numId w:val="5"/>
         </w:numPr>
         <w:spacing w:after="60"/>
       </w:pPr>
@@ -1122,7 +1122,7 @@
         <w:pStyle w:val="ListParagraph"/>
         <w:numPr>
           <w:ilvl w:val="0"/>
-          <w:numId w:val="3"/>
+          <w:numId w:val="5"/>
         </w:numPr>
         <w:spacing w:after="60"/>
       </w:pPr>
@@ -1155,7 +1155,7 @@
         <w:pStyle w:val="ListParagraph"/>
         <w:numPr>
           <w:ilvl w:val="0"/>
-          <w:numId w:val="3"/>
+          <w:numId w:val="6"/>
         </w:numPr>
         <w:spacing w:after="60"/>
       </w:pPr>
@@ -1172,7 +1172,7 @@
         <w:pStyle w:val="ListParagraph"/>
         <w:numPr>
           <w:ilvl w:val="0"/>
-          <w:numId w:val="3"/>
+          <w:numId w:val="6"/>
         </w:numPr>
         <w:spacing w:after="60"/>
       </w:pPr>
@@ -1189,7 +1189,7 @@
         <w:pStyle w:val="ListParagraph"/>
         <w:numPr>
           <w:ilvl w:val="0"/>
-          <w:numId w:val="3"/>
+          <w:numId w:val="6"/>
         </w:numPr>
         <w:spacing w:after="60"/>
       </w:pPr>
@@ -1222,7 +1222,7 @@
         <w:pStyle w:val="ListParagraph"/>
         <w:numPr>
           <w:ilvl w:val="0"/>
-          <w:numId w:val="3"/>
+          <w:numId w:val="7"/>
         </w:numPr>
         <w:spacing w:after="60"/>
       </w:pPr>
@@ -1239,7 +1239,7 @@
         <w:pStyle w:val="ListParagraph"/>
         <w:numPr>
           <w:ilvl w:val="0"/>
-          <w:numId w:val="3"/>
+          <w:numId w:val="7"/>
         </w:numPr>
         <w:spacing w:after="60"/>
       </w:pPr>
@@ -1256,7 +1256,7 @@
         <w:pStyle w:val="ListParagraph"/>
         <w:numPr>
           <w:ilvl w:val="0"/>
-          <w:numId w:val="3"/>
+          <w:numId w:val="7"/>
         </w:numPr>
         <w:spacing w:after="60"/>
       </w:pPr>
@@ -1289,7 +1289,7 @@
         <w:pStyle w:val="ListParagraph"/>
         <w:numPr>
           <w:ilvl w:val="0"/>
-          <w:numId w:val="3"/>
+          <w:numId w:val="8"/>
         </w:numPr>
         <w:spacing w:after="60"/>
       </w:pPr>
@@ -1306,7 +1306,7 @@
         <w:pStyle w:val="ListParagraph"/>
         <w:numPr>
           <w:ilvl w:val="0"/>
-          <w:numId w:val="3"/>
+          <w:numId w:val="8"/>
         </w:numPr>
         <w:spacing w:after="60"/>
       </w:pPr>
@@ -1323,7 +1323,7 @@
         <w:pStyle w:val="ListParagraph"/>
         <w:numPr>
           <w:ilvl w:val="0"/>
-          <w:numId w:val="3"/>
+          <w:numId w:val="8"/>
         </w:numPr>
         <w:spacing w:after="60"/>
       </w:pPr>
@@ -3265,6 +3265,138 @@
       </w:pPr>
     </w:lvl>
   </w:abstractNum>
+  <w:abstractNum w:abstractNumId="4" w15:restartNumberingAfterBreak="0">
+    <w:multiLevelType w:val="hybridMultilevel"/>
+    <w:lvl w:ilvl="0" w15:tentative="1">
+      <w:start w:val="1"/>
+      <w:numFmt w:val="decimal"/>
+      <w:lvlText w:val="%1."/>
+      <w:lvlJc w:val="left"/>
+      <w:pPr>
+        <w:ind w:left="400" w:hanging="260"/>
+      </w:pPr>
+    </w:lvl>
+  </w:abstractNum>
+  <w:abstractNum w:abstractNumId="5" w15:restartNumberingAfterBreak="0">
+    <w:multiLevelType w:val="hybridMultilevel"/>
+    <w:lvl w:ilvl="0" w15:tentative="1">
+      <w:start w:val="1"/>
+      <w:numFmt w:val="decimal"/>
+      <w:lvlText w:val="%1."/>
+      <w:lvlJc w:val="left"/>
+      <w:pPr>
+        <w:ind w:left="400" w:hanging="260"/>
+      </w:pPr>
+    </w:lvl>
+  </w:abstractNum>
+  <w:abstractNum w:abstractNumId="6" w15:restartNumberingAfterBreak="0">
+    <w:multiLevelType w:val="hybridMultilevel"/>
+    <w:lvl w:ilvl="0" w15:tentative="1">
+      <w:start w:val="1"/>
+      <w:numFmt w:val="decimal"/>
+      <w:lvlText w:val="%1."/>
+      <w:lvlJc w:val="left"/>
+      <w:pPr>
+        <w:ind w:left="400" w:hanging="260"/>
+      </w:pPr>
+    </w:lvl>
+  </w:abstractNum>
+  <w:abstractNum w:abstractNumId="7" w15:restartNumberingAfterBreak="0">
+    <w:multiLevelType w:val="hybridMultilevel"/>
+    <w:lvl w:ilvl="0" w15:tentative="1">
+      <w:start w:val="1"/>
+      <w:numFmt w:val="decimal"/>
+      <w:lvlText w:val="%1."/>
+      <w:lvlJc w:val="left"/>
+      <w:pPr>
+        <w:ind w:left="400" w:hanging="260"/>
+      </w:pPr>
+    </w:lvl>
+  </w:abstractNum>
+  <w:abstractNum w:abstractNumId="8" w15:restartNumberingAfterBreak="0">
+    <w:multiLevelType w:val="hybridMultilevel"/>
+    <w:lvl w:ilvl="0" w15:tentative="1">
+      <w:start w:val="1"/>
+      <w:numFmt w:val="decimal"/>
+      <w:lvlText w:val="%1."/>
+      <w:lvlJc w:val="left"/>
+      <w:pPr>
+        <w:ind w:left="400" w:hanging="260"/>
+      </w:pPr>
+    </w:lvl>
+  </w:abstractNum>
+  <w:abstractNum w:abstractNumId="9" w15:restartNumberingAfterBreak="0">
+    <w:multiLevelType w:val="hybridMultilevel"/>
+    <w:lvl w:ilvl="0" w15:tentative="1">
+      <w:start w:val="1"/>
+      <w:numFmt w:val="decimal"/>
+      <w:lvlText w:val="%1."/>
+      <w:lvlJc w:val="left"/>
+      <w:pPr>
+        <w:ind w:left="400" w:hanging="260"/>
+      </w:pPr>
+    </w:lvl>
+  </w:abstractNum>
+  <w:abstractNum w:abstractNumId="10" w15:restartNumberingAfterBreak="0">
+    <w:multiLevelType w:val="hybridMultilevel"/>
+    <w:lvl w:ilvl="0" w15:tentative="1">
+      <w:start w:val="1"/>
+      <w:numFmt w:val="decimal"/>
+      <w:lvlText w:val="%1."/>
+      <w:lvlJc w:val="left"/>
+      <w:pPr>
+        <w:ind w:left="400" w:hanging="260"/>
+      </w:pPr>
+    </w:lvl>
+  </w:abstractNum>
+  <w:abstractNum w:abstractNumId="11" w15:restartNumberingAfterBreak="0">
+    <w:multiLevelType w:val="hybridMultilevel"/>
+    <w:lvl w:ilvl="0" w15:tentative="1">
+      <w:start w:val="1"/>
+      <w:numFmt w:val="decimal"/>
+      <w:lvlText w:val="%1."/>
+      <w:lvlJc w:val="left"/>
+      <w:pPr>
+        <w:ind w:left="400" w:hanging="260"/>
+      </w:pPr>
+    </w:lvl>
+  </w:abstractNum>
+  <w:abstractNum w:abstractNumId="12" w15:restartNumberingAfterBreak="0">
+    <w:multiLevelType w:val="hybridMultilevel"/>
+    <w:lvl w:ilvl="0" w15:tentative="1">
+      <w:start w:val="1"/>
+      <w:numFmt w:val="decimal"/>
+      <w:lvlText w:val="%1."/>
+      <w:lvlJc w:val="left"/>
+      <w:pPr>
+        <w:ind w:left="400" w:hanging="260"/>
+      </w:pPr>
+    </w:lvl>
+  </w:abstractNum>
+  <w:abstractNum w:abstractNumId="13" w15:restartNumberingAfterBreak="0">
+    <w:multiLevelType w:val="hybridMultilevel"/>
+    <w:lvl w:ilvl="0" w15:tentative="1">
+      <w:start w:val="1"/>
+      <w:numFmt w:val="decimal"/>
+      <w:lvlText w:val="%1."/>
+      <w:lvlJc w:val="left"/>
+      <w:pPr>
+        <w:ind w:left="400" w:hanging="260"/>
+      </w:pPr>
+    </w:lvl>
+  </w:abstractNum>
+  <w:abstractNum w:abstractNumId="14" w15:restartNumberingAfterBreak="0">
+    <w:multiLevelType w:val="hybridMultilevel"/>
+    <w:lvl w:ilvl="0" w15:tentative="1">
+      <w:start w:val="1"/>
+      <w:numFmt w:val="decimal"/>
+      <w:lvlText w:val="%1."/>
+      <w:lvlJc w:val="left"/>
+      <w:pPr>
+        <w:ind w:left="400" w:hanging="260"/>
+      </w:pPr>
+    </w:lvl>
+  </w:abstractNum>
   <w:num w:numId="1">
     <w:abstractNumId w:val="1"/>
     <w:lvlOverride w:ilvl="0">
@@ -3279,6 +3411,36 @@
   </w:num>
   <w:num w:numId="3">
     <w:abstractNumId w:val="3"/>
+    <w:lvlOverride w:ilvl="0">
+      <w:startOverride w:val="1"/>
+    </w:lvlOverride>
+  </w:num>
+  <w:num w:numId="4">
+    <w:abstractNumId w:val="4"/>
+    <w:lvlOverride w:ilvl="0">
+      <w:startOverride w:val="1"/>
+    </w:lvlOverride>
+  </w:num>
+  <w:num w:numId="5">
+    <w:abstractNumId w:val="5"/>
+    <w:lvlOverride w:ilvl="0">
+      <w:startOverride w:val="1"/>
+    </w:lvlOverride>
+  </w:num>
+  <w:num w:numId="6">
+    <w:abstractNumId w:val="6"/>
+    <w:lvlOverride w:ilvl="0">
+      <w:startOverride w:val="1"/>
+    </w:lvlOverride>
+  </w:num>
+  <w:num w:numId="7">
+    <w:abstractNumId w:val="7"/>
+    <w:lvlOverride w:ilvl="0">
+      <w:startOverride w:val="1"/>
+    </w:lvlOverride>
+  </w:num>
+  <w:num w:numId="8">
+    <w:abstractNumId w:val="8"/>
     <w:lvlOverride w:ilvl="0">
       <w:startOverride w:val="1"/>
     </w:lvlOverride>

</xml_diff>

<commit_message>
docs: support guide library Wave 1 + fix: activity timestamp overflow, org switcher tenant navigation (#159)
Support guide system (master catalog, branded generators, 5 Wave-1 guides) plus two live-testing fixes: activity card header wraps on small screens; workspace switcher navigates to the selected org's subdomain so the dashboard actually switches tenant.
</commit_message>
<xml_diff>
--- a/docs/support/ONEKOF_SUPPORT_GUIDE_SPRINTS.docx
+++ b/docs/support/ONEKOF_SUPPORT_GUIDE_SPRINTS.docx
@@ -109,7 +109,7 @@
           <w:sz w:val="21"/>
           <w:szCs w:val="21"/>
         </w:rPr>
-        <w:t xml:space="preserve">Version 1.0 · July 25, 2026</w:t>
+        <w:t xml:space="preserve">Version 1.1 · July 25, 2026</w:t>
       </w:r>
     </w:p>
     <w:p>
@@ -1021,7 +1021,7 @@
         <w:pStyle w:val="ListParagraph"/>
         <w:numPr>
           <w:ilvl w:val="0"/>
-          <w:numId w:val="3"/>
+          <w:numId w:val="4"/>
         </w:numPr>
         <w:spacing w:after="60"/>
       </w:pPr>
@@ -1038,7 +1038,7 @@
         <w:pStyle w:val="ListParagraph"/>
         <w:numPr>
           <w:ilvl w:val="0"/>
-          <w:numId w:val="3"/>
+          <w:numId w:val="4"/>
         </w:numPr>
         <w:spacing w:after="60"/>
       </w:pPr>
@@ -1055,7 +1055,7 @@
         <w:pStyle w:val="ListParagraph"/>
         <w:numPr>
           <w:ilvl w:val="0"/>
-          <w:numId w:val="3"/>
+          <w:numId w:val="4"/>
         </w:numPr>
         <w:spacing w:after="60"/>
       </w:pPr>
@@ -1088,7 +1088,7 @@
         <w:pStyle w:val="ListParagraph"/>
         <w:numPr>
           <w:ilvl w:val="0"/>
-          <w:numId w:val="3"/>
+          <w:numId w:val="5"/>
         </w:numPr>
         <w:spacing w:after="60"/>
       </w:pPr>
@@ -1105,7 +1105,7 @@
         <w:pStyle w:val="ListParagraph"/>
         <w:numPr>
           <w:ilvl w:val="0"/>
-          <w:numId w:val="3"/>
+          <w:numId w:val="5"/>
         </w:numPr>
         <w:spacing w:after="60"/>
       </w:pPr>
@@ -1122,7 +1122,7 @@
         <w:pStyle w:val="ListParagraph"/>
         <w:numPr>
           <w:ilvl w:val="0"/>
-          <w:numId w:val="3"/>
+          <w:numId w:val="5"/>
         </w:numPr>
         <w:spacing w:after="60"/>
       </w:pPr>
@@ -1155,7 +1155,7 @@
         <w:pStyle w:val="ListParagraph"/>
         <w:numPr>
           <w:ilvl w:val="0"/>
-          <w:numId w:val="3"/>
+          <w:numId w:val="6"/>
         </w:numPr>
         <w:spacing w:after="60"/>
       </w:pPr>
@@ -1172,7 +1172,7 @@
         <w:pStyle w:val="ListParagraph"/>
         <w:numPr>
           <w:ilvl w:val="0"/>
-          <w:numId w:val="3"/>
+          <w:numId w:val="6"/>
         </w:numPr>
         <w:spacing w:after="60"/>
       </w:pPr>
@@ -1189,7 +1189,7 @@
         <w:pStyle w:val="ListParagraph"/>
         <w:numPr>
           <w:ilvl w:val="0"/>
-          <w:numId w:val="3"/>
+          <w:numId w:val="6"/>
         </w:numPr>
         <w:spacing w:after="60"/>
       </w:pPr>
@@ -1222,7 +1222,7 @@
         <w:pStyle w:val="ListParagraph"/>
         <w:numPr>
           <w:ilvl w:val="0"/>
-          <w:numId w:val="3"/>
+          <w:numId w:val="7"/>
         </w:numPr>
         <w:spacing w:after="60"/>
       </w:pPr>
@@ -1239,7 +1239,7 @@
         <w:pStyle w:val="ListParagraph"/>
         <w:numPr>
           <w:ilvl w:val="0"/>
-          <w:numId w:val="3"/>
+          <w:numId w:val="7"/>
         </w:numPr>
         <w:spacing w:after="60"/>
       </w:pPr>
@@ -1256,7 +1256,7 @@
         <w:pStyle w:val="ListParagraph"/>
         <w:numPr>
           <w:ilvl w:val="0"/>
-          <w:numId w:val="3"/>
+          <w:numId w:val="7"/>
         </w:numPr>
         <w:spacing w:after="60"/>
       </w:pPr>
@@ -1289,7 +1289,7 @@
         <w:pStyle w:val="ListParagraph"/>
         <w:numPr>
           <w:ilvl w:val="0"/>
-          <w:numId w:val="3"/>
+          <w:numId w:val="8"/>
         </w:numPr>
         <w:spacing w:after="60"/>
       </w:pPr>
@@ -1306,7 +1306,7 @@
         <w:pStyle w:val="ListParagraph"/>
         <w:numPr>
           <w:ilvl w:val="0"/>
-          <w:numId w:val="3"/>
+          <w:numId w:val="8"/>
         </w:numPr>
         <w:spacing w:after="60"/>
       </w:pPr>
@@ -1323,7 +1323,7 @@
         <w:pStyle w:val="ListParagraph"/>
         <w:numPr>
           <w:ilvl w:val="0"/>
-          <w:numId w:val="3"/>
+          <w:numId w:val="8"/>
         </w:numPr>
         <w:spacing w:after="60"/>
       </w:pPr>
@@ -3265,6 +3265,138 @@
       </w:pPr>
     </w:lvl>
   </w:abstractNum>
+  <w:abstractNum w:abstractNumId="4" w15:restartNumberingAfterBreak="0">
+    <w:multiLevelType w:val="hybridMultilevel"/>
+    <w:lvl w:ilvl="0" w15:tentative="1">
+      <w:start w:val="1"/>
+      <w:numFmt w:val="decimal"/>
+      <w:lvlText w:val="%1."/>
+      <w:lvlJc w:val="left"/>
+      <w:pPr>
+        <w:ind w:left="400" w:hanging="260"/>
+      </w:pPr>
+    </w:lvl>
+  </w:abstractNum>
+  <w:abstractNum w:abstractNumId="5" w15:restartNumberingAfterBreak="0">
+    <w:multiLevelType w:val="hybridMultilevel"/>
+    <w:lvl w:ilvl="0" w15:tentative="1">
+      <w:start w:val="1"/>
+      <w:numFmt w:val="decimal"/>
+      <w:lvlText w:val="%1."/>
+      <w:lvlJc w:val="left"/>
+      <w:pPr>
+        <w:ind w:left="400" w:hanging="260"/>
+      </w:pPr>
+    </w:lvl>
+  </w:abstractNum>
+  <w:abstractNum w:abstractNumId="6" w15:restartNumberingAfterBreak="0">
+    <w:multiLevelType w:val="hybridMultilevel"/>
+    <w:lvl w:ilvl="0" w15:tentative="1">
+      <w:start w:val="1"/>
+      <w:numFmt w:val="decimal"/>
+      <w:lvlText w:val="%1."/>
+      <w:lvlJc w:val="left"/>
+      <w:pPr>
+        <w:ind w:left="400" w:hanging="260"/>
+      </w:pPr>
+    </w:lvl>
+  </w:abstractNum>
+  <w:abstractNum w:abstractNumId="7" w15:restartNumberingAfterBreak="0">
+    <w:multiLevelType w:val="hybridMultilevel"/>
+    <w:lvl w:ilvl="0" w15:tentative="1">
+      <w:start w:val="1"/>
+      <w:numFmt w:val="decimal"/>
+      <w:lvlText w:val="%1."/>
+      <w:lvlJc w:val="left"/>
+      <w:pPr>
+        <w:ind w:left="400" w:hanging="260"/>
+      </w:pPr>
+    </w:lvl>
+  </w:abstractNum>
+  <w:abstractNum w:abstractNumId="8" w15:restartNumberingAfterBreak="0">
+    <w:multiLevelType w:val="hybridMultilevel"/>
+    <w:lvl w:ilvl="0" w15:tentative="1">
+      <w:start w:val="1"/>
+      <w:numFmt w:val="decimal"/>
+      <w:lvlText w:val="%1."/>
+      <w:lvlJc w:val="left"/>
+      <w:pPr>
+        <w:ind w:left="400" w:hanging="260"/>
+      </w:pPr>
+    </w:lvl>
+  </w:abstractNum>
+  <w:abstractNum w:abstractNumId="9" w15:restartNumberingAfterBreak="0">
+    <w:multiLevelType w:val="hybridMultilevel"/>
+    <w:lvl w:ilvl="0" w15:tentative="1">
+      <w:start w:val="1"/>
+      <w:numFmt w:val="decimal"/>
+      <w:lvlText w:val="%1."/>
+      <w:lvlJc w:val="left"/>
+      <w:pPr>
+        <w:ind w:left="400" w:hanging="260"/>
+      </w:pPr>
+    </w:lvl>
+  </w:abstractNum>
+  <w:abstractNum w:abstractNumId="10" w15:restartNumberingAfterBreak="0">
+    <w:multiLevelType w:val="hybridMultilevel"/>
+    <w:lvl w:ilvl="0" w15:tentative="1">
+      <w:start w:val="1"/>
+      <w:numFmt w:val="decimal"/>
+      <w:lvlText w:val="%1."/>
+      <w:lvlJc w:val="left"/>
+      <w:pPr>
+        <w:ind w:left="400" w:hanging="260"/>
+      </w:pPr>
+    </w:lvl>
+  </w:abstractNum>
+  <w:abstractNum w:abstractNumId="11" w15:restartNumberingAfterBreak="0">
+    <w:multiLevelType w:val="hybridMultilevel"/>
+    <w:lvl w:ilvl="0" w15:tentative="1">
+      <w:start w:val="1"/>
+      <w:numFmt w:val="decimal"/>
+      <w:lvlText w:val="%1."/>
+      <w:lvlJc w:val="left"/>
+      <w:pPr>
+        <w:ind w:left="400" w:hanging="260"/>
+      </w:pPr>
+    </w:lvl>
+  </w:abstractNum>
+  <w:abstractNum w:abstractNumId="12" w15:restartNumberingAfterBreak="0">
+    <w:multiLevelType w:val="hybridMultilevel"/>
+    <w:lvl w:ilvl="0" w15:tentative="1">
+      <w:start w:val="1"/>
+      <w:numFmt w:val="decimal"/>
+      <w:lvlText w:val="%1."/>
+      <w:lvlJc w:val="left"/>
+      <w:pPr>
+        <w:ind w:left="400" w:hanging="260"/>
+      </w:pPr>
+    </w:lvl>
+  </w:abstractNum>
+  <w:abstractNum w:abstractNumId="13" w15:restartNumberingAfterBreak="0">
+    <w:multiLevelType w:val="hybridMultilevel"/>
+    <w:lvl w:ilvl="0" w15:tentative="1">
+      <w:start w:val="1"/>
+      <w:numFmt w:val="decimal"/>
+      <w:lvlText w:val="%1."/>
+      <w:lvlJc w:val="left"/>
+      <w:pPr>
+        <w:ind w:left="400" w:hanging="260"/>
+      </w:pPr>
+    </w:lvl>
+  </w:abstractNum>
+  <w:abstractNum w:abstractNumId="14" w15:restartNumberingAfterBreak="0">
+    <w:multiLevelType w:val="hybridMultilevel"/>
+    <w:lvl w:ilvl="0" w15:tentative="1">
+      <w:start w:val="1"/>
+      <w:numFmt w:val="decimal"/>
+      <w:lvlText w:val="%1."/>
+      <w:lvlJc w:val="left"/>
+      <w:pPr>
+        <w:ind w:left="400" w:hanging="260"/>
+      </w:pPr>
+    </w:lvl>
+  </w:abstractNum>
   <w:num w:numId="1">
     <w:abstractNumId w:val="1"/>
     <w:lvlOverride w:ilvl="0">
@@ -3279,6 +3411,36 @@
   </w:num>
   <w:num w:numId="3">
     <w:abstractNumId w:val="3"/>
+    <w:lvlOverride w:ilvl="0">
+      <w:startOverride w:val="1"/>
+    </w:lvlOverride>
+  </w:num>
+  <w:num w:numId="4">
+    <w:abstractNumId w:val="4"/>
+    <w:lvlOverride w:ilvl="0">
+      <w:startOverride w:val="1"/>
+    </w:lvlOverride>
+  </w:num>
+  <w:num w:numId="5">
+    <w:abstractNumId w:val="5"/>
+    <w:lvlOverride w:ilvl="0">
+      <w:startOverride w:val="1"/>
+    </w:lvlOverride>
+  </w:num>
+  <w:num w:numId="6">
+    <w:abstractNumId w:val="6"/>
+    <w:lvlOverride w:ilvl="0">
+      <w:startOverride w:val="1"/>
+    </w:lvlOverride>
+  </w:num>
+  <w:num w:numId="7">
+    <w:abstractNumId w:val="7"/>
+    <w:lvlOverride w:ilvl="0">
+      <w:startOverride w:val="1"/>
+    </w:lvlOverride>
+  </w:num>
+  <w:num w:numId="8">
+    <w:abstractNumId w:val="8"/>
     <w:lvlOverride w:ilvl="0">
       <w:startOverride w:val="1"/>
     </w:lvlOverride>

</xml_diff>